<commit_message>
Initial assessment and No-PQE applicant support
Adds an initial assessment flow and tracking for applications: migration to add initial_assessment_* columns, model fillables/casts, and controller logic to submit, validate and store initial assessment answers in session and on application create. JobVacancyController: submitInitialAssessment endpoint, session helpers, vacancy checks to block apply until assessment is completed, and evaluation helpers for education/eligibility alignment. ShowApplicantsProfile and admin views: add No PQE partitioning, counts, AJAX endpoint and partial to list applicants without PQE, and UI updates to manage_applicants/applications_list to surface the new tab. Also updates job description frontend to submit the assessment via AJAX and handle PQE prompt, and a small WES PDF signature positioning fix.
</commit_message>
<xml_diff>
--- a/storage/app/temp/wes_clone_replaceblock.docx
+++ b/storage/app/temp/wes_clone_replaceblock.docx
@@ -693,7 +693,7 @@
         <mc:AlternateContent>
           <mc:Choice Requires="wps">
             <w:drawing>
-              <wp:anchor distT="0" distB="0" distL="114300" distR="114300" simplePos="0" relativeHeight="251660288" behindDoc="0" locked="0" layoutInCell="1" allowOverlap="1">
+              <wp:anchor distT="0" distB="0" distL="114300" distR="114300" simplePos="0" relativeHeight="251660288" behindDoc="0" locked="0" layoutInCell="1" allowOverlap="1" wp14:anchorId="05BBF91A" wp14:editId="174FFFFD">
                 <wp:simplePos x="0" y="0"/>
                 <wp:positionH relativeFrom="margin">
                   <wp:align>center</wp:align>
@@ -872,7 +872,7 @@
                 <w:b w:val="0"/>
                 <w:bCs w:val="0"/>
               </w:rPr>
-              <w:t>TEST USER</w:t>
+              <w:t xml:space="preserve">               TEST USER</w:t>
             </w:r>
           </w:p>
         </w:tc>

</xml_diff>